<commit_message>
Documents mis a jour
</commit_message>
<xml_diff>
--- a/docs/CEO_BIBLE.docx
+++ b/docs/CEO_BIBLE.docx
@@ -2,7 +2,7 @@
 <file path=word/document.xml><?xml version="1.0" encoding="utf-8"?>
 <w:document xmlns:w="http://schemas.openxmlformats.org/wordprocessingml/2006/main" xmlns:m="http://schemas.openxmlformats.org/officeDocument/2006/math" xmlns:r="http://schemas.openxmlformats.org/officeDocument/2006/relationships" xmlns:o="urn:schemas-microsoft-com:office:office" xmlns:v="urn:schemas-microsoft-com:vml" xmlns:w10="urn:schemas-microsoft-com:office:word" xmlns:a="http://schemas.openxmlformats.org/drawingml/2006/main" xmlns:pic="http://schemas.openxmlformats.org/drawingml/2006/picture" xmlns:wp="http://schemas.openxmlformats.org/drawingml/2006/wordprocessingDrawing">
   <w:body>
-    <w:bookmarkStart w:id="73" w:name="ceo-bible--pièces"/>
+    <w:bookmarkStart w:id="84" w:name="ceo-bible--pièces"/>
     <w:p>
       <w:pPr>
         <w:pStyle w:val="Heading1"/>
@@ -97,7 +97,7 @@
       <w:r>
         <w:t xml:space="preserve"> </w:t>
       </w:r>
-      <w:hyperlink r:id="rId9">
+      <w:hyperlink r:id="rId20">
         <w:r>
           <w:rPr>
             <w:rStyle w:val="VerbatimChar"/>
@@ -114,7 +114,7 @@
       <w:r>
         <w:t xml:space="preserve"> </w:t>
       </w:r>
-      <w:hyperlink r:id="rId10">
+      <w:hyperlink r:id="rId21">
         <w:r>
           <w:rPr>
             <w:rStyle w:val="VerbatimChar"/>
@@ -136,7 +136,7 @@
         </w:pict>
       </w:r>
     </w:p>
-    <w:bookmarkStart w:id="11" w:name="Xd1024c92292dbd693f3b9f813cf88813fe44e42"/>
+    <w:bookmarkStart w:id="22" w:name="Xd1024c92292dbd693f3b9f813cf88813fe44e42"/>
     <w:p>
       <w:pPr>
         <w:pStyle w:val="Heading2"/>
@@ -371,8 +371,8 @@
         </w:pict>
       </w:r>
     </w:p>
-    <w:bookmarkEnd w:id="11"/>
-    <w:bookmarkStart w:id="15" w:name="X21bec87bd2844f45efe0912ccf77b41d35a9c3f"/>
+    <w:bookmarkEnd w:id="22"/>
+    <w:bookmarkStart w:id="26" w:name="X21bec87bd2844f45efe0912ccf77b41d35a9c3f"/>
     <w:p>
       <w:pPr>
         <w:pStyle w:val="Heading2"/>
@@ -381,7 +381,7 @@
         <w:t xml:space="preserve">2. Le marché — taille, structure, dynamique</w:t>
       </w:r>
     </w:p>
-    <w:bookmarkStart w:id="12" w:name="Xb89e8d038e8ae63aea0f91864ed7c603bedd577"/>
+    <w:bookmarkStart w:id="23" w:name="Xb89e8d038e8ae63aea0f91864ed7c603bedd577"/>
     <w:p>
       <w:pPr>
         <w:pStyle w:val="Heading3"/>
@@ -854,8 +854,8 @@
         <w:t xml:space="preserve">(~5 à 8 M USD).</w:t>
       </w:r>
     </w:p>
-    <w:bookmarkEnd w:id="12"/>
-    <w:bookmarkStart w:id="13" w:name="X551645ce3f15aca9f6abbbf2effbdf236f5375a"/>
+    <w:bookmarkEnd w:id="23"/>
+    <w:bookmarkStart w:id="24" w:name="X551645ce3f15aca9f6abbbf2effbdf236f5375a"/>
     <w:p>
       <w:pPr>
         <w:pStyle w:val="Heading3"/>
@@ -974,8 +974,8 @@
         <w:t xml:space="preserve">(~40 acteurs structurés). Pièces de récupération sur carcasses, prix attractif, volume limité.</w:t>
       </w:r>
     </w:p>
-    <w:bookmarkEnd w:id="13"/>
-    <w:bookmarkStart w:id="14" w:name="X54140778297c86bcbd2395be3c2127db8177753"/>
+    <w:bookmarkEnd w:id="24"/>
+    <w:bookmarkStart w:id="25" w:name="X54140778297c86bcbd2395be3c2127db8177753"/>
     <w:p>
       <w:pPr>
         <w:pStyle w:val="Heading3"/>
@@ -1315,9 +1315,9 @@
         </w:pict>
       </w:r>
     </w:p>
-    <w:bookmarkEnd w:id="14"/>
-    <w:bookmarkEnd w:id="15"/>
-    <w:bookmarkStart w:id="20" w:name="Xd2d69ded894dd15c2902f042ac5ab0a89812123"/>
+    <w:bookmarkEnd w:id="25"/>
+    <w:bookmarkEnd w:id="26"/>
+    <w:bookmarkStart w:id="31" w:name="Xd2d69ded894dd15c2902f042ac5ab0a89812123"/>
     <w:p>
       <w:pPr>
         <w:pStyle w:val="Heading2"/>
@@ -1326,7 +1326,7 @@
         <w:t xml:space="preserve">3. Concurrence — qui est là, qui ne l'est pas</w:t>
       </w:r>
     </w:p>
-    <w:bookmarkStart w:id="16" w:name="X45f6a74072689f3b639c72d5338081ab3900af2"/>
+    <w:bookmarkStart w:id="27" w:name="X45f6a74072689f3b639c72d5338081ab3900af2"/>
     <w:p>
       <w:pPr>
         <w:pStyle w:val="Heading3"/>
@@ -1351,7 +1351,16 @@
         <w:t xml:space="preserve">Aucun acteur structuré à l'échelle nationale</w:t>
       </w:r>
       <w:r>
-        <w:t xml:space="preserve">. Quelques pages Facebook (« Pièces Auto Abidjan »), groupes WhatsApp informels, et tentatives ponctuelles e-commerce qui n'ont pas tenu.</w:t>
+        <w:t xml:space="preserve">. Quelques pages Facebook (« Pièces Auto Abidjan »), groupes WhatsApp informels, et tentatives ponctuelles e-commerce qui n'ont pas tenu. Recensement à jour : ~48 acteurs Facebook dont 29 vendeurs pièces CI (</w:t>
+      </w:r>
+      <w:r>
+        <w:rPr>
+          <w:rStyle w:val="VerbatimChar"/>
+        </w:rPr>
+        <w:t xml:space="preserve">_bmad-output/planning-artifacts/facebook-vendeurs/</w:t>
+      </w:r>
+      <w:r>
+        <w:t xml:space="preserve">, 2026-05-29).</w:t>
       </w:r>
     </w:p>
     <w:p>
@@ -1367,6 +1376,57 @@
           <w:b/>
           <w:bCs/>
         </w:rPr>
+        <w:t xml:space="preserve">global-auto.online</w:t>
+      </w:r>
+      <w:r>
+        <w:t xml:space="preserve"> </w:t>
+      </w:r>
+      <w:r>
+        <w:t xml:space="preserve">: le seul concurrent avec un vrai catalogue web structuré (API publique). On en a</w:t>
+      </w:r>
+      <w:r>
+        <w:t xml:space="preserve"> </w:t>
+      </w:r>
+      <w:r>
+        <w:rPr>
+          <w:b/>
+          <w:bCs/>
+        </w:rPr>
+        <w:t xml:space="preserve">miroité l'intégralité dans notre catalogue</w:t>
+      </w:r>
+      <w:r>
+        <w:t xml:space="preserve"> </w:t>
+      </w:r>
+      <w:r>
+        <w:t xml:space="preserve">au 2026-05-29 (3 780 références prix + arbre véhicules complet) — non comme cession à l'adversaire, mais comme</w:t>
+      </w:r>
+      <w:r>
+        <w:t xml:space="preserve"> </w:t>
+      </w:r>
+      <w:r>
+        <w:rPr>
+          <w:b/>
+          <w:bCs/>
+        </w:rPr>
+        <w:t xml:space="preserve">veille prix permanente + couverture catalogue jour 1</w:t>
+      </w:r>
+      <w:r>
+        <w:t xml:space="preserve">. Stratégiquement : on connaît leurs prix en continu, eux pas les nôtres.</w:t>
+      </w:r>
+    </w:p>
+    <w:p>
+      <w:pPr>
+        <w:pStyle w:val="Compact"/>
+        <w:numPr>
+          <w:ilvl w:val="0"/>
+          <w:numId w:val="1003"/>
+        </w:numPr>
+      </w:pPr>
+      <w:r>
+        <w:rPr>
+          <w:b/>
+          <w:bCs/>
+        </w:rPr>
         <w:t xml:space="preserve">Jumia / Glovo / Yango Tech</w:t>
       </w:r>
       <w:r>
@@ -1376,8 +1436,8 @@
         <w:t xml:space="preserve">: pas de catalogue pièces, pas d'expertise verticale. Ne sont pas une menace à court terme mais pourraient acquérir un acteur établi à 24-36 mois.</w:t>
       </w:r>
     </w:p>
-    <w:bookmarkEnd w:id="16"/>
-    <w:bookmarkStart w:id="17" w:name="X08dd2cdf1c15784adfc30fa4ec6ccc1ceccdfd2"/>
+    <w:bookmarkEnd w:id="27"/>
+    <w:bookmarkStart w:id="28" w:name="X08dd2cdf1c15784adfc30fa4ec6ccc1ceccdfd2"/>
     <w:p>
       <w:pPr>
         <w:pStyle w:val="Heading3"/>
@@ -1452,8 +1512,8 @@
         <w:t xml:space="preserve">(Fleetio, Geotab) : trop chers, trop génériques, pas localisés (pas de FCFA, pas de fournisseurs CI, pas de FNE-CI).</w:t>
       </w:r>
     </w:p>
-    <w:bookmarkEnd w:id="17"/>
-    <w:bookmarkStart w:id="18" w:name="Xb5c0040416bc83eabb037b2ea9f5edf04d59ca3"/>
+    <w:bookmarkEnd w:id="28"/>
+    <w:bookmarkStart w:id="29" w:name="Xb5c0040416bc83eabb037b2ea9f5edf04d59ca3"/>
     <w:p>
       <w:pPr>
         <w:pStyle w:val="Heading3"/>
@@ -1506,8 +1566,8 @@
         <w:t xml:space="preserve">: concurrents sur la garantie constructeur, mais hors de prix pour les véhicules de plus de 5 ans (90% du parc). On capture ce qu'ils ne servent pas.</w:t>
       </w:r>
     </w:p>
-    <w:bookmarkEnd w:id="18"/>
-    <w:bookmarkStart w:id="19" w:name="Xa3383bf5768cc30fcd081592f069aab75a2dedf"/>
+    <w:bookmarkEnd w:id="29"/>
+    <w:bookmarkStart w:id="30" w:name="Xa3383bf5768cc30fcd081592f069aab75a2dedf"/>
     <w:p>
       <w:pPr>
         <w:pStyle w:val="Heading3"/>
@@ -1634,9 +1694,9 @@
         </w:pict>
       </w:r>
     </w:p>
-    <w:bookmarkEnd w:id="19"/>
-    <w:bookmarkEnd w:id="20"/>
-    <w:bookmarkStart w:id="24" w:name="Xa51ae0ced374a627eb985a01fae5adb16623b5f"/>
+    <w:bookmarkEnd w:id="30"/>
+    <w:bookmarkEnd w:id="31"/>
+    <w:bookmarkStart w:id="35" w:name="Xa51ae0ced374a627eb985a01fae5adb16623b5f"/>
     <w:p>
       <w:pPr>
         <w:pStyle w:val="Heading2"/>
@@ -1645,7 +1705,7 @@
         <w:t xml:space="preserve">4. Positionnement et proposition de valeur</w:t>
       </w:r>
     </w:p>
-    <w:bookmarkStart w:id="21" w:name="X211f8f57e9cad01e897c26d7d4804e17e296034"/>
+    <w:bookmarkStart w:id="32" w:name="X211f8f57e9cad01e897c26d7d4804e17e296034"/>
     <w:p>
       <w:pPr>
         <w:pStyle w:val="Heading3"/>
@@ -1764,8 +1824,8 @@
         <w:t xml:space="preserve">: « Tu gagnes une commission sur chaque vente que tu déclenches pour les vendeurs que tu as onboardés. »</w:t>
       </w:r>
     </w:p>
-    <w:bookmarkEnd w:id="21"/>
-    <w:bookmarkStart w:id="22" w:name="Xb35e53cce09a3e38b4659d923df6de13534139c"/>
+    <w:bookmarkEnd w:id="32"/>
+    <w:bookmarkStart w:id="33" w:name="Xb35e53cce09a3e38b4659d923df6de13534139c"/>
     <w:p>
       <w:pPr>
         <w:pStyle w:val="Heading3"/>
@@ -1873,8 +1933,8 @@
         <w:t xml:space="preserve">(escrow, garantie, facture normalisée DGI).</w:t>
       </w:r>
     </w:p>
-    <w:bookmarkEnd w:id="22"/>
-    <w:bookmarkStart w:id="23" w:name="X2cdbe38b05827046a4011804ff305a13de6877a"/>
+    <w:bookmarkEnd w:id="33"/>
+    <w:bookmarkStart w:id="34" w:name="X2cdbe38b05827046a4011804ff305a13de6877a"/>
     <w:p>
       <w:pPr>
         <w:pStyle w:val="Heading3"/>
@@ -1973,9 +2033,9 @@
         </w:pict>
       </w:r>
     </w:p>
-    <w:bookmarkEnd w:id="23"/>
-    <w:bookmarkEnd w:id="24"/>
-    <w:bookmarkStart w:id="30" w:name="X076f50ab137ddb315c545907b39c0180ecdc1ca"/>
+    <w:bookmarkEnd w:id="34"/>
+    <w:bookmarkEnd w:id="35"/>
+    <w:bookmarkStart w:id="41" w:name="X076f50ab137ddb315c545907b39c0180ecdc1ca"/>
     <w:p>
       <w:pPr>
         <w:pStyle w:val="Heading2"/>
@@ -1984,7 +2044,7 @@
         <w:t xml:space="preserve">5. La stratégie en 5 mouvements (24 mois)</w:t>
       </w:r>
     </w:p>
-    <w:bookmarkStart w:id="25" w:name="Xa1022c661079494230e5fd2ef22f35c7c3d96e3"/>
+    <w:bookmarkStart w:id="36" w:name="Xa1022c661079494230e5fd2ef22f35c7c3d96e3"/>
     <w:p>
       <w:pPr>
         <w:pStyle w:val="Heading3"/>
@@ -2115,8 +2175,8 @@
         <w:t xml:space="preserve">: 150+ commandes/jour à fin M3, 350+ à fin M6.</w:t>
       </w:r>
     </w:p>
-    <w:bookmarkEnd w:id="25"/>
-    <w:bookmarkStart w:id="26" w:name="X604f7bb6dce60abd3d0ef62cfe2ea6fe29f3028"/>
+    <w:bookmarkEnd w:id="36"/>
+    <w:bookmarkStart w:id="37" w:name="X604f7bb6dce60abd3d0ef62cfe2ea6fe29f3028"/>
     <w:p>
       <w:pPr>
         <w:pStyle w:val="Heading3"/>
@@ -2267,8 +2327,8 @@
         <w:t xml:space="preserve">: 500 véhicules sous abonnement à M9, 1 500 à M12, churn &lt; 5%/mois.</w:t>
       </w:r>
     </w:p>
-    <w:bookmarkEnd w:id="26"/>
-    <w:bookmarkStart w:id="27" w:name="Xb65c934d831f9cdb63b1fea6b46114a3258f94c"/>
+    <w:bookmarkEnd w:id="37"/>
+    <w:bookmarkStart w:id="38" w:name="Xb65c934d831f9cdb63b1fea6b46114a3258f94c"/>
     <w:p>
       <w:pPr>
         <w:pStyle w:val="Heading3"/>
@@ -2405,8 +2465,8 @@
         <w:t xml:space="preserve">: 5 000 factures FNE-CI émises à M12, 25 000 à M15.</w:t>
       </w:r>
     </w:p>
-    <w:bookmarkEnd w:id="27"/>
-    <w:bookmarkStart w:id="28" w:name="Xd84e98ba68735eada0cfed14204a82b3143463f"/>
+    <w:bookmarkEnd w:id="38"/>
+    <w:bookmarkStart w:id="39" w:name="Xd84e98ba68735eada0cfed14204a82b3143463f"/>
     <w:p>
       <w:pPr>
         <w:pStyle w:val="Heading3"/>
@@ -2499,8 +2559,8 @@
         <w:t xml:space="preserve">Offre transport collectif (UNATRCI, syndicats gbaka) : pricing tier intermédiaire, paiement groupé syndical.</w:t>
       </w:r>
     </w:p>
-    <w:bookmarkEnd w:id="28"/>
-    <w:bookmarkStart w:id="29" w:name="Xb85b14ad853b70698f58bc87ccac1759e191d02"/>
+    <w:bookmarkEnd w:id="39"/>
+    <w:bookmarkStart w:id="40" w:name="Xb85b14ad853b70698f58bc87ccac1759e191d02"/>
     <w:p>
       <w:pPr>
         <w:pStyle w:val="Heading3"/>
@@ -2606,9 +2666,9 @@
         </w:pict>
       </w:r>
     </w:p>
-    <w:bookmarkEnd w:id="29"/>
-    <w:bookmarkEnd w:id="30"/>
-    <w:bookmarkStart w:id="34" w:name="Xa81a8ec7edad8896f41af6303d6148e9f2a6336"/>
+    <w:bookmarkEnd w:id="40"/>
+    <w:bookmarkEnd w:id="41"/>
+    <w:bookmarkStart w:id="45" w:name="Xa81a8ec7edad8896f41af6303d6148e9f2a6336"/>
     <w:p>
       <w:pPr>
         <w:pStyle w:val="Heading2"/>
@@ -2617,7 +2677,7 @@
         <w:t xml:space="preserve">6. Modèle économique — comment Pièces gagne de l'argent</w:t>
       </w:r>
     </w:p>
-    <w:bookmarkStart w:id="31" w:name="X5c66d5d9885df1772825564efef71a1ad222843"/>
+    <w:bookmarkStart w:id="42" w:name="X5c66d5d9885df1772825564efef71a1ad222843"/>
     <w:p>
       <w:pPr>
         <w:pStyle w:val="Heading3"/>
@@ -2816,8 +2876,8 @@
         </w:tc>
       </w:tr>
     </w:tbl>
-    <w:bookmarkEnd w:id="31"/>
-    <w:bookmarkStart w:id="32" w:name="X7fd7804bc8b5e125ed35978acca4c5bef1bd56c"/>
+    <w:bookmarkEnd w:id="42"/>
+    <w:bookmarkStart w:id="43" w:name="X7fd7804bc8b5e125ed35978acca4c5bef1bd56c"/>
     <w:p>
       <w:pPr>
         <w:pStyle w:val="Heading3"/>
@@ -2936,8 +2996,8 @@
         <w:t xml:space="preserve">: &gt; 4 sur tous les segments dès M12.</w:t>
       </w:r>
     </w:p>
-    <w:bookmarkEnd w:id="32"/>
-    <w:bookmarkStart w:id="33" w:name="X7fa8afa9aad2a0b8d7d96539a0c0f4287ea7247"/>
+    <w:bookmarkEnd w:id="43"/>
+    <w:bookmarkStart w:id="44" w:name="X7fa8afa9aad2a0b8d7d96539a0c0f4287ea7247"/>
     <w:p>
       <w:pPr>
         <w:pStyle w:val="Heading3"/>
@@ -3001,9 +3061,9 @@
         </w:pict>
       </w:r>
     </w:p>
-    <w:bookmarkEnd w:id="33"/>
-    <w:bookmarkEnd w:id="34"/>
-    <w:bookmarkStart w:id="38" w:name="X4a34cc10c32c7fcafed93dbeeab3db6c110b222"/>
+    <w:bookmarkEnd w:id="44"/>
+    <w:bookmarkEnd w:id="45"/>
+    <w:bookmarkStart w:id="49" w:name="X4a34cc10c32c7fcafed93dbeeab3db6c110b222"/>
     <w:p>
       <w:pPr>
         <w:pStyle w:val="Heading2"/>
@@ -3012,7 +3072,7 @@
         <w:t xml:space="preserve">7. GTM — go-to-market opérationnel</w:t>
       </w:r>
     </w:p>
-    <w:bookmarkStart w:id="35" w:name="X9cc70b76dcbe75e2cdf8c637165478c2ef50f00"/>
+    <w:bookmarkStart w:id="46" w:name="X9cc70b76dcbe75e2cdf8c637165478c2ef50f00"/>
     <w:p>
       <w:pPr>
         <w:pStyle w:val="Heading3"/>
@@ -3150,8 +3210,8 @@
         <w:t xml:space="preserve">Programme de parrainage vendeur → vendeur (5 000 F par vendeur amené qui fait sa première vente).</w:t>
       </w:r>
     </w:p>
-    <w:bookmarkEnd w:id="35"/>
-    <w:bookmarkStart w:id="36" w:name="Xa15e8b492b3365d5ceba4d0e8d1b0a275047e12"/>
+    <w:bookmarkEnd w:id="46"/>
+    <w:bookmarkStart w:id="47" w:name="Xa15e8b492b3365d5ceba4d0e8d1b0a275047e12"/>
     <w:p>
       <w:pPr>
         <w:pStyle w:val="Heading3"/>
@@ -3259,8 +3319,8 @@
         <w:t xml:space="preserve">(les Liaisons recommandent Pièces aux mécaniciens qu'ils croisent en cantine).</w:t>
       </w:r>
     </w:p>
-    <w:bookmarkEnd w:id="36"/>
-    <w:bookmarkStart w:id="37" w:name="X1ab38090f5863a840116a3b3a28145788034b90"/>
+    <w:bookmarkEnd w:id="47"/>
+    <w:bookmarkStart w:id="48" w:name="X1ab38090f5863a840116a3b3a28145788034b90"/>
     <w:p>
       <w:pPr>
         <w:pStyle w:val="Heading3"/>
@@ -3408,9 +3468,9 @@
         </w:pict>
       </w:r>
     </w:p>
-    <w:bookmarkEnd w:id="37"/>
-    <w:bookmarkEnd w:id="38"/>
-    <w:bookmarkStart w:id="42" w:name="X24bc5f9db31a5adbf29bd3cb129e6e5ccc50062"/>
+    <w:bookmarkEnd w:id="48"/>
+    <w:bookmarkEnd w:id="49"/>
+    <w:bookmarkStart w:id="53" w:name="X24bc5f9db31a5adbf29bd3cb129e6e5ccc50062"/>
     <w:p>
       <w:pPr>
         <w:pStyle w:val="Heading2"/>
@@ -3419,7 +3479,7 @@
         <w:t xml:space="preserve">8. Organisation cible — équipe à 12, 24 et 36 mois</w:t>
       </w:r>
     </w:p>
-    <w:bookmarkStart w:id="39" w:name="Xdcf3a7ca454681044c019b58f1d8f8d9a3ec579"/>
+    <w:bookmarkStart w:id="50" w:name="Xdcf3a7ca454681044c019b58f1d8f8d9a3ec579"/>
     <w:p>
       <w:pPr>
         <w:pStyle w:val="Heading3"/>
@@ -3688,8 +3748,8 @@
         </w:tc>
       </w:tr>
     </w:tbl>
-    <w:bookmarkEnd w:id="39"/>
-    <w:bookmarkStart w:id="40" w:name="X1add776e5141a0e3931fa8dc2332a865cfb9ca8"/>
+    <w:bookmarkEnd w:id="50"/>
+    <w:bookmarkStart w:id="51" w:name="X1add776e5141a0e3931fa8dc2332a865cfb9ca8"/>
     <w:p>
       <w:pPr>
         <w:pStyle w:val="Heading3"/>
@@ -3766,8 +3826,8 @@
         <w:t xml:space="preserve">Doublement Liaison et commercial.</w:t>
       </w:r>
     </w:p>
-    <w:bookmarkEnd w:id="40"/>
-    <w:bookmarkStart w:id="41" w:name="Xb0676059d508a7bec0efc8669030c05f91c18cb"/>
+    <w:bookmarkEnd w:id="51"/>
+    <w:bookmarkStart w:id="52" w:name="Xb0676059d508a7bec0efc8669030c05f91c18cb"/>
     <w:p>
       <w:pPr>
         <w:pStyle w:val="Heading3"/>
@@ -3871,9 +3931,9 @@
         </w:pict>
       </w:r>
     </w:p>
-    <w:bookmarkEnd w:id="41"/>
-    <w:bookmarkEnd w:id="42"/>
-    <w:bookmarkStart w:id="46" w:name="X593eea8d4480f240afae1cc23ec216a87c8ebf9"/>
+    <w:bookmarkEnd w:id="52"/>
+    <w:bookmarkEnd w:id="53"/>
+    <w:bookmarkStart w:id="57" w:name="X593eea8d4480f240afae1cc23ec216a87c8ebf9"/>
     <w:p>
       <w:pPr>
         <w:pStyle w:val="Heading2"/>
@@ -3882,7 +3942,7 @@
         <w:t xml:space="preserve">9. Financement — combien, quand, pour quoi</w:t>
       </w:r>
     </w:p>
-    <w:bookmarkStart w:id="43" w:name="Xf862580d9d9f9a171b2ec51fa16fbc457b2b3d8"/>
+    <w:bookmarkStart w:id="54" w:name="Xf862580d9d9f9a171b2ec51fa16fbc457b2b3d8"/>
     <w:p>
       <w:pPr>
         <w:pStyle w:val="Heading3"/>
@@ -3959,8 +4019,8 @@
         <w:t xml:space="preserve">Affectation : expansion nationale et sous-régionale, BTP/corporate, FNE-CI scale.</w:t>
       </w:r>
     </w:p>
-    <w:bookmarkEnd w:id="43"/>
-    <w:bookmarkStart w:id="44" w:name="Xe49fb0a1ad84adb40fc1cf6704dd4bfdf6ff955"/>
+    <w:bookmarkEnd w:id="54"/>
+    <w:bookmarkStart w:id="55" w:name="Xe49fb0a1ad84adb40fc1cf6704dd4bfdf6ff955"/>
     <w:p>
       <w:pPr>
         <w:pStyle w:val="Heading3"/>
@@ -4029,8 +4089,8 @@
         <w:t xml:space="preserve">Churn flotte &lt; 5%/mois.</w:t>
       </w:r>
     </w:p>
-    <w:bookmarkEnd w:id="44"/>
-    <w:bookmarkStart w:id="45" w:name="Xe043c9ea8ab228e350bc1ff5f20eaa2791731a5"/>
+    <w:bookmarkEnd w:id="55"/>
+    <w:bookmarkStart w:id="56" w:name="Xe043c9ea8ab228e350bc1ff5f20eaa2791731a5"/>
     <w:p>
       <w:pPr>
         <w:pStyle w:val="Heading3"/>
@@ -4112,9 +4172,9 @@
         </w:pict>
       </w:r>
     </w:p>
-    <w:bookmarkEnd w:id="45"/>
-    <w:bookmarkEnd w:id="46"/>
-    <w:bookmarkStart w:id="47" w:name="X2b53c5a34afa5a68e084293b26a7f83655ebc84"/>
+    <w:bookmarkEnd w:id="56"/>
+    <w:bookmarkEnd w:id="57"/>
+    <w:bookmarkStart w:id="58" w:name="X2b53c5a34afa5a68e084293b26a7f83655ebc84"/>
     <w:p>
       <w:pPr>
         <w:pStyle w:val="Heading2"/>
@@ -4734,8 +4794,8 @@
         </w:pict>
       </w:r>
     </w:p>
-    <w:bookmarkEnd w:id="47"/>
-    <w:bookmarkStart w:id="51" w:name="Xfc9c688d1163d4bf09bdf4f87dd9b44c45bcf94"/>
+    <w:bookmarkEnd w:id="58"/>
+    <w:bookmarkStart w:id="62" w:name="Xfc9c688d1163d4bf09bdf4f87dd9b44c45bcf94"/>
     <w:p>
       <w:pPr>
         <w:pStyle w:val="Heading2"/>
@@ -4744,7 +4804,7 @@
         <w:t xml:space="preserve">11. KPIs — le dashboard CEO</w:t>
       </w:r>
     </w:p>
-    <w:bookmarkStart w:id="48" w:name="Xb116fcd2687239f6adcb4b3737d9db5ab7c2cc0"/>
+    <w:bookmarkStart w:id="59" w:name="Xb116fcd2687239f6adcb4b3737d9db5ab7c2cc0"/>
     <w:p>
       <w:pPr>
         <w:pStyle w:val="Heading3"/>
@@ -4813,8 +4873,8 @@
         <w:t xml:space="preserve">Cash en banque, runway projeté.</w:t>
       </w:r>
     </w:p>
-    <w:bookmarkEnd w:id="48"/>
-    <w:bookmarkStart w:id="49" w:name="Xa128e8f828b8d864fd5fae1cebae033023048f9"/>
+    <w:bookmarkEnd w:id="59"/>
+    <w:bookmarkStart w:id="60" w:name="Xa128e8f828b8d864fd5fae1cebae033023048f9"/>
     <w:p>
       <w:pPr>
         <w:pStyle w:val="Heading3"/>
@@ -4907,8 +4967,8 @@
         <w:t xml:space="preserve">Disputes ouvertes / résolues, taux de fraude.</w:t>
       </w:r>
     </w:p>
-    <w:bookmarkEnd w:id="49"/>
-    <w:bookmarkStart w:id="50" w:name="Xbc31cc420dbef19fbc1f31687be12296c70982f"/>
+    <w:bookmarkEnd w:id="60"/>
+    <w:bookmarkStart w:id="61" w:name="Xbc31cc420dbef19fbc1f31687be12296c70982f"/>
     <w:p>
       <w:pPr>
         <w:pStyle w:val="Heading3"/>
@@ -4984,9 +5044,9 @@
         </w:pict>
       </w:r>
     </w:p>
-    <w:bookmarkEnd w:id="50"/>
-    <w:bookmarkEnd w:id="51"/>
-    <w:bookmarkStart w:id="55" w:name="Xb4676d605a51ba097b847dca5484a484cdbadb9"/>
+    <w:bookmarkEnd w:id="61"/>
+    <w:bookmarkEnd w:id="62"/>
+    <w:bookmarkStart w:id="66" w:name="Xb4676d605a51ba097b847dca5484a484cdbadb9"/>
     <w:p>
       <w:pPr>
         <w:pStyle w:val="Heading2"/>
@@ -4995,7 +5055,7 @@
         <w:t xml:space="preserve">12. Gouvernance — comment décider</w:t>
       </w:r>
     </w:p>
-    <w:bookmarkStart w:id="52" w:name="Xb2c5dec2c5270899f8712643926c709911e8af2"/>
+    <w:bookmarkStart w:id="63" w:name="Xb2c5dec2c5270899f8712643926c709911e8af2"/>
     <w:p>
       <w:pPr>
         <w:pStyle w:val="Heading3"/>
@@ -5092,8 +5152,8 @@
         <w:t xml:space="preserve">(1.5 jour) revue mouvements 1-5, ajustement roadmap.</w:t>
       </w:r>
     </w:p>
-    <w:bookmarkEnd w:id="52"/>
-    <w:bookmarkStart w:id="53" w:name="X9cd96ea2403ee89f7d668b8637f5d9e89d423fd"/>
+    <w:bookmarkEnd w:id="63"/>
+    <w:bookmarkStart w:id="64" w:name="X9cd96ea2403ee89f7d668b8637f5d9e89d423fd"/>
     <w:p>
       <w:pPr>
         <w:pStyle w:val="Heading3"/>
@@ -5212,8 +5272,8 @@
         <w:t xml:space="preserve">: CEO + Board approval.</w:t>
       </w:r>
     </w:p>
-    <w:bookmarkEnd w:id="53"/>
-    <w:bookmarkStart w:id="54" w:name="X87aaa63aeefdb9d32087aab78b9895e3f2799b9"/>
+    <w:bookmarkEnd w:id="64"/>
+    <w:bookmarkStart w:id="65" w:name="X87aaa63aeefdb9d32087aab78b9895e3f2799b9"/>
     <w:p>
       <w:pPr>
         <w:pStyle w:val="Heading3"/>
@@ -5241,9 +5301,9 @@
         </w:pict>
       </w:r>
     </w:p>
-    <w:bookmarkEnd w:id="54"/>
-    <w:bookmarkEnd w:id="55"/>
-    <w:bookmarkStart w:id="60" w:name="X37e16ef4ff2676dddc4cdd6b3f400ef781962dc"/>
+    <w:bookmarkEnd w:id="65"/>
+    <w:bookmarkEnd w:id="66"/>
+    <w:bookmarkStart w:id="71" w:name="X37e16ef4ff2676dddc4cdd6b3f400ef781962dc"/>
     <w:p>
       <w:pPr>
         <w:pStyle w:val="Heading2"/>
@@ -5252,7 +5312,7 @@
         <w:t xml:space="preserve">13. Marque, communication, image publique</w:t>
       </w:r>
     </w:p>
-    <w:bookmarkStart w:id="56" w:name="Xa6cc849612e0d6bdef22e3c36e57e52d2863f77"/>
+    <w:bookmarkStart w:id="67" w:name="Xa6cc849612e0d6bdef22e3c36e57e52d2863f77"/>
     <w:p>
       <w:pPr>
         <w:pStyle w:val="Heading3"/>
@@ -5277,8 +5337,8 @@
         <w:t xml:space="preserve">Décliné B2B : « Pièces — votre flotte, votre coût, votre contrôle. »</w:t>
       </w:r>
     </w:p>
-    <w:bookmarkEnd w:id="56"/>
-    <w:bookmarkStart w:id="57" w:name="Xd60af454fb754a5a077be3f03ee8423e8caad79"/>
+    <w:bookmarkEnd w:id="67"/>
+    <w:bookmarkStart w:id="68" w:name="Xd60af454fb754a5a077be3f03ee8423e8caad79"/>
     <w:p>
       <w:pPr>
         <w:pStyle w:val="Heading3"/>
@@ -5307,8 +5367,8 @@
         <w:t xml:space="preserve">. Règles d'or : transparence (chips condition), clarté (breakdown), franc-parler en français ivoirien acceptable (pas trop institutionnel pour le canal mécanicien, plus sobre pour le B2B).</w:t>
       </w:r>
     </w:p>
-    <w:bookmarkEnd w:id="57"/>
-    <w:bookmarkStart w:id="58" w:name="Xd128178b9e4c46ccb1daabba4c8b7a740a4070b"/>
+    <w:bookmarkEnd w:id="68"/>
+    <w:bookmarkStart w:id="69" w:name="Xd128178b9e4c46ccb1daabba4c8b7a740a4070b"/>
     <w:p>
       <w:pPr>
         <w:pStyle w:val="Heading3"/>
@@ -5369,8 +5429,8 @@
         <w:t xml:space="preserve">Adhésion CGECI, JCI Côte d'Ivoire, GAPI. Présence visible aux événements ministère Transports, ministère Commerce.</w:t>
       </w:r>
     </w:p>
-    <w:bookmarkEnd w:id="58"/>
-    <w:bookmarkStart w:id="59" w:name="X12a59c7ef80c7916f0ff1c8631cc791a935b646"/>
+    <w:bookmarkEnd w:id="69"/>
+    <w:bookmarkStart w:id="70" w:name="X12a59c7ef80c7916f0ff1c8631cc791a935b646"/>
     <w:p>
       <w:pPr>
         <w:pStyle w:val="Heading3"/>
@@ -5410,9 +5470,9 @@
         </w:pict>
       </w:r>
     </w:p>
-    <w:bookmarkEnd w:id="59"/>
-    <w:bookmarkEnd w:id="60"/>
-    <w:bookmarkStart w:id="64" w:name="X4a40e63ceaae4c0919c2fc20b00892e906041f7"/>
+    <w:bookmarkEnd w:id="70"/>
+    <w:bookmarkEnd w:id="71"/>
+    <w:bookmarkStart w:id="75" w:name="X4a40e63ceaae4c0919c2fc20b00892e906041f7"/>
     <w:p>
       <w:pPr>
         <w:pStyle w:val="Heading2"/>
@@ -5421,7 +5481,7 @@
         <w:t xml:space="preserve">14. Conformité et risques légaux</w:t>
       </w:r>
     </w:p>
-    <w:bookmarkStart w:id="61" w:name="X567cc01974def157ee1e22e71a916609e0d2694"/>
+    <w:bookmarkStart w:id="72" w:name="X567cc01974def157ee1e22e71a916609e0d2694"/>
     <w:p>
       <w:pPr>
         <w:pStyle w:val="Heading3"/>
@@ -5454,8 +5514,8 @@
         <w:t xml:space="preserve">Holding sous-régionale envisageable à M24 pour expansion Sénégal / Bénin.</w:t>
       </w:r>
     </w:p>
-    <w:bookmarkEnd w:id="61"/>
-    <w:bookmarkStart w:id="62" w:name="X0ad535d1627f7e42faff995b7777f39e4e6ba41"/>
+    <w:bookmarkEnd w:id="72"/>
+    <w:bookmarkStart w:id="73" w:name="X0ad535d1627f7e42faff995b7777f39e4e6ba41"/>
     <w:p>
       <w:pPr>
         <w:pStyle w:val="Heading3"/>
@@ -5574,8 +5634,8 @@
         <w:t xml:space="preserve">: partenariats agréés (CinetPay agréé, OM, MTN, Wave directs à étudier).</w:t>
       </w:r>
     </w:p>
-    <w:bookmarkEnd w:id="62"/>
-    <w:bookmarkStart w:id="63" w:name="X58d3ab2fa0979a402a63b97ba715836b96db79c"/>
+    <w:bookmarkEnd w:id="73"/>
+    <w:bookmarkStart w:id="74" w:name="X58d3ab2fa0979a402a63b97ba715836b96db79c"/>
     <w:p>
       <w:pPr>
         <w:pStyle w:val="Heading3"/>
@@ -5651,9 +5711,9 @@
         </w:pict>
       </w:r>
     </w:p>
-    <w:bookmarkEnd w:id="63"/>
-    <w:bookmarkEnd w:id="64"/>
-    <w:bookmarkStart w:id="69" w:name="X5ff9242d6781c90c8e6c52f4743fb3e410053ed"/>
+    <w:bookmarkEnd w:id="74"/>
+    <w:bookmarkEnd w:id="75"/>
+    <w:bookmarkStart w:id="80" w:name="X5ff9242d6781c90c8e6c52f4743fb3e410053ed"/>
     <w:p>
       <w:pPr>
         <w:pStyle w:val="Heading2"/>
@@ -5662,7 +5722,7 @@
         <w:t xml:space="preserve">15. Roadmap produit — vue CEO (détails CTO Bible)</w:t>
       </w:r>
     </w:p>
-    <w:bookmarkStart w:id="65" w:name="Xb8df14f0763cfd70a41bbd4017b51cc2212b6f1"/>
+    <w:bookmarkStart w:id="76" w:name="Xb8df14f0763cfd70a41bbd4017b51cc2212b6f1"/>
     <w:p>
       <w:pPr>
         <w:pStyle w:val="Heading3"/>
@@ -5719,8 +5779,8 @@
         <w:t xml:space="preserve">Bot WhatsApp officiel (onboarding mécanicien, recherche pièce, suivi commande).</w:t>
       </w:r>
     </w:p>
-    <w:bookmarkEnd w:id="65"/>
-    <w:bookmarkStart w:id="66" w:name="X0bc070c58935ebfd6b301c9a7cb5de5ab9ce5b1"/>
+    <w:bookmarkEnd w:id="76"/>
+    <w:bookmarkStart w:id="77" w:name="X0bc070c58935ebfd6b301c9a7cb5de5ab9ce5b1"/>
     <w:p>
       <w:pPr>
         <w:pStyle w:val="Heading3"/>
@@ -5777,8 +5837,8 @@
         <w:t xml:space="preserve">API publique flotte (Yango, Heetch, Treepz).</w:t>
       </w:r>
     </w:p>
-    <w:bookmarkEnd w:id="66"/>
-    <w:bookmarkStart w:id="67" w:name="X6c703f757c73cc937f99c8704ef486ca25a34de"/>
+    <w:bookmarkEnd w:id="77"/>
+    <w:bookmarkStart w:id="78" w:name="X6c703f757c73cc937f99c8704ef486ca25a34de"/>
     <w:p>
       <w:pPr>
         <w:pStyle w:val="Heading3"/>
@@ -5835,8 +5895,8 @@
         <w:t xml:space="preserve">Marketplace main-d'œuvre (réseau garages affiliés) — à arbitrer M12 si focus pièces tient.</w:t>
       </w:r>
     </w:p>
-    <w:bookmarkEnd w:id="67"/>
-    <w:bookmarkStart w:id="68" w:name="Xa364296760401cfcfeb394be2d9f0ef269ae65e"/>
+    <w:bookmarkEnd w:id="78"/>
+    <w:bookmarkStart w:id="79" w:name="Xa364296760401cfcfeb394be2d9f0ef269ae65e"/>
     <w:p>
       <w:pPr>
         <w:pStyle w:val="Heading3"/>
@@ -5888,9 +5948,9 @@
         </w:pict>
       </w:r>
     </w:p>
-    <w:bookmarkEnd w:id="68"/>
-    <w:bookmarkEnd w:id="69"/>
-    <w:bookmarkStart w:id="70" w:name="X442d85207afe55442dc52d86f09fe733e6105f3"/>
+    <w:bookmarkEnd w:id="79"/>
+    <w:bookmarkEnd w:id="80"/>
+    <w:bookmarkStart w:id="81" w:name="X442d85207afe55442dc52d86f09fe733e6105f3"/>
     <w:p>
       <w:pPr>
         <w:pStyle w:val="Heading2"/>
@@ -6108,8 +6168,8 @@
         </w:pict>
       </w:r>
     </w:p>
-    <w:bookmarkEnd w:id="70"/>
-    <w:bookmarkStart w:id="71" w:name="X5d5e7c3dca51020e0044f9ad461dba9d5242de0"/>
+    <w:bookmarkEnd w:id="81"/>
+    <w:bookmarkStart w:id="82" w:name="X5d5e7c3dca51020e0044f9ad461dba9d5242de0"/>
     <w:p>
       <w:pPr>
         <w:pStyle w:val="Heading2"/>
@@ -6345,8 +6405,8 @@
         </w:pict>
       </w:r>
     </w:p>
-    <w:bookmarkEnd w:id="71"/>
-    <w:bookmarkStart w:id="72" w:name="X44e6735b00e4e32432cf055c09e9a26c4859220"/>
+    <w:bookmarkEnd w:id="82"/>
+    <w:bookmarkStart w:id="83" w:name="X44e6735b00e4e32432cf055c09e9a26c4859220"/>
     <w:p>
       <w:pPr>
         <w:pStyle w:val="Heading2"/>
@@ -6617,8 +6677,8 @@
         <w:t xml:space="preserve">Document interne · Handover CEO · v1.0 · 28 mai 2026.</w:t>
       </w:r>
     </w:p>
-    <w:bookmarkEnd w:id="72"/>
-    <w:bookmarkEnd w:id="73"/>
+    <w:bookmarkEnd w:id="83"/>
+    <w:bookmarkEnd w:id="84"/>
     <w:sectPr>
       <w:footnotePr>
         <w:numRestart w:val="eachSect"/>
@@ -7243,10 +7303,10 @@
   <w:docDefaults>
     <w:rPrDefault>
       <w:rPr>
-        <w:rFonts w:asciiTheme="minorHAnsi" w:cstheme="minorBidi" w:eastAsiaTheme="minorEastAsia" w:hAnsiTheme="minorHAnsi"/>
+        <w:rFonts w:asciiTheme="minorHAnsi" w:cstheme="minorBidi" w:eastAsiaTheme="minorHAnsi" w:hAnsiTheme="minorHAnsi"/>
         <w:sz w:val="24"/>
         <w:szCs w:val="24"/>
-        <w:lang w:bidi="ar-SA" w:eastAsia="zh-CN" w:val="en-US"/>
+        <w:lang w:bidi="ar-SA" w:eastAsia="en-US" w:val="en-US"/>
       </w:rPr>
     </w:rPrDefault>
     <w:pPrDefault>
@@ -7787,6 +7847,13 @@
       </w:tblCellMar>
     </w:tblPr>
     <w:tblStylePr w:type="firstRow">
+      <w:tblPr>
+        <w:jc w:val="left"/>
+        <w:tblInd w:type="dxa" w:w="0"/>
+      </w:tblPr>
+      <w:trPr>
+        <w:jc w:val="left"/>
+      </w:trPr>
       <w:tcPr>
         <w:tcBorders>
           <w:bottom w:val="single"/>

</xml_diff>

<commit_message>
docs(commercial): retire le titre slug + réduit la police d'entête
- build.sh: --metadata title → pagetitle (supprime le bloc <h1> slug
  injecté en début de document par pandoc --standalone)
- style.css: .meta 8.5pt → 7pt (entête CATEGORY/SUBTITLE moins imposante)
- régénère .docx/.pdf des 28 documents

Co-Authored-By: Claude Opus 4.8 (1M context) <noreply@anthropic.com>
</commit_message>
<xml_diff>
--- a/docs/CEO_BIBLE.docx
+++ b/docs/CEO_BIBLE.docx
@@ -6679,11 +6679,7 @@
     </w:p>
     <w:bookmarkEnd w:id="83"/>
     <w:bookmarkEnd w:id="84"/>
-    <w:sectPr>
-      <w:footnotePr>
-        <w:numRestart w:val="eachSect"/>
-      </w:footnotePr>
-    </w:sectPr>
+    <w:sectPr/>
   </w:body>
 </w:document>
 </file>
@@ -7358,6 +7354,8 @@
     </w:pPr>
     <w:rPr>
       <w:rFonts w:asciiTheme="majorHAnsi" w:cstheme="majorBidi" w:eastAsiaTheme="majorEastAsia" w:hAnsiTheme="majorHAnsi"/>
+      <w:spacing w:val="-10"/>
+      <w:kern w:val="28"/>
       <w:sz w:val="56"/>
       <w:szCs w:val="56"/>
     </w:rPr>
@@ -7370,6 +7368,8 @@
     <w:rsid w:val="00A10FD9"/>
     <w:rPr>
       <w:rFonts w:asciiTheme="majorHAnsi" w:cstheme="majorBidi" w:eastAsiaTheme="majorEastAsia" w:hAnsiTheme="majorHAnsi"/>
+      <w:spacing w:val="-10"/>
+      <w:kern w:val="28"/>
       <w:sz w:val="56"/>
       <w:szCs w:val="56"/>
     </w:rPr>
@@ -7410,31 +7410,23 @@
   </w:style>
   <w:style w:customStyle="1" w:styleId="Author" w:type="paragraph">
     <w:name w:val="Author"/>
-    <w:basedOn w:val="Title"/>
     <w:next w:val="BodyText"/>
     <w:qFormat/>
     <w:pPr>
       <w:keepNext/>
       <w:keepLines/>
+      <w:jc w:val="center"/>
     </w:pPr>
-    <w:rPr>
-      <w:sz w:val="24"/>
-      <w:szCs w:val="24"/>
-    </w:rPr>
   </w:style>
   <w:style w:styleId="Date" w:type="paragraph">
     <w:name w:val="Date"/>
-    <w:basedOn w:val="Title"/>
     <w:next w:val="BodyText"/>
     <w:qFormat/>
     <w:pPr>
       <w:keepNext/>
       <w:keepLines/>
+      <w:jc w:val="center"/>
     </w:pPr>
-    <w:rPr>
-      <w:sz w:val="24"/>
-      <w:szCs w:val="24"/>
-    </w:rPr>
   </w:style>
   <w:style w:customStyle="1" w:styleId="AbstractTitle" w:type="paragraph">
     <w:name w:val="Abstract Title"/>

</xml_diff>

<commit_message>
docs: régénère tous les documents au standard v2
- 25 docs (manuels, brochures, offres, pricing, bibles) reconstruits :
  titres Gloock navy, puces ▸ orange, H2 souligné, catégorie header orange,
  libellés de tableau en orange
- deck rendu opt-in (<p class="deck">) pour ne pas gonfler les blocs méta
- PDF rendus via Chrome (sans footer — WeasyPrint indisponible sur cette machine)

Co-Authored-By: Claude Opus 4.8 (1M context) <noreply@anthropic.com>
</commit_message>
<xml_diff>
--- a/docs/CEO_BIBLE.docx
+++ b/docs/CEO_BIBLE.docx
@@ -2,7 +2,7 @@
 <file path=word/document.xml><?xml version="1.0" encoding="utf-8"?>
 <w:document xmlns:w="http://schemas.openxmlformats.org/wordprocessingml/2006/main" xmlns:m="http://schemas.openxmlformats.org/officeDocument/2006/math" xmlns:r="http://schemas.openxmlformats.org/officeDocument/2006/relationships" xmlns:o="urn:schemas-microsoft-com:office:office" xmlns:v="urn:schemas-microsoft-com:vml" xmlns:w10="urn:schemas-microsoft-com:office:word" xmlns:a="http://schemas.openxmlformats.org/drawingml/2006/main" xmlns:pic="http://schemas.openxmlformats.org/drawingml/2006/picture" xmlns:wp="http://schemas.openxmlformats.org/drawingml/2006/wordprocessingDrawing">
   <w:body>
-    <w:bookmarkStart w:id="84" w:name="ceo-bible--pièces"/>
+    <w:bookmarkStart w:id="73" w:name="ceo-bible--pièces"/>
     <w:p>
       <w:pPr>
         <w:pStyle w:val="Heading1"/>
@@ -97,7 +97,7 @@
       <w:r>
         <w:t xml:space="preserve"> </w:t>
       </w:r>
-      <w:hyperlink r:id="rId20">
+      <w:hyperlink r:id="rId9">
         <w:r>
           <w:rPr>
             <w:rStyle w:val="VerbatimChar"/>
@@ -114,7 +114,7 @@
       <w:r>
         <w:t xml:space="preserve"> </w:t>
       </w:r>
-      <w:hyperlink r:id="rId21">
+      <w:hyperlink r:id="rId10">
         <w:r>
           <w:rPr>
             <w:rStyle w:val="VerbatimChar"/>
@@ -136,7 +136,7 @@
         </w:pict>
       </w:r>
     </w:p>
-    <w:bookmarkStart w:id="22" w:name="Xd1024c92292dbd693f3b9f813cf88813fe44e42"/>
+    <w:bookmarkStart w:id="11" w:name="Xd1024c92292dbd693f3b9f813cf88813fe44e42"/>
     <w:p>
       <w:pPr>
         <w:pStyle w:val="Heading2"/>
@@ -371,8 +371,8 @@
         </w:pict>
       </w:r>
     </w:p>
-    <w:bookmarkEnd w:id="22"/>
-    <w:bookmarkStart w:id="26" w:name="X21bec87bd2844f45efe0912ccf77b41d35a9c3f"/>
+    <w:bookmarkEnd w:id="11"/>
+    <w:bookmarkStart w:id="15" w:name="X21bec87bd2844f45efe0912ccf77b41d35a9c3f"/>
     <w:p>
       <w:pPr>
         <w:pStyle w:val="Heading2"/>
@@ -381,7 +381,7 @@
         <w:t xml:space="preserve">2. Le marché — taille, structure, dynamique</w:t>
       </w:r>
     </w:p>
-    <w:bookmarkStart w:id="23" w:name="Xb89e8d038e8ae63aea0f91864ed7c603bedd577"/>
+    <w:bookmarkStart w:id="12" w:name="Xb89e8d038e8ae63aea0f91864ed7c603bedd577"/>
     <w:p>
       <w:pPr>
         <w:pStyle w:val="Heading3"/>
@@ -854,8 +854,8 @@
         <w:t xml:space="preserve">(~5 à 8 M USD).</w:t>
       </w:r>
     </w:p>
-    <w:bookmarkEnd w:id="23"/>
-    <w:bookmarkStart w:id="24" w:name="X551645ce3f15aca9f6abbbf2effbdf236f5375a"/>
+    <w:bookmarkEnd w:id="12"/>
+    <w:bookmarkStart w:id="13" w:name="X551645ce3f15aca9f6abbbf2effbdf236f5375a"/>
     <w:p>
       <w:pPr>
         <w:pStyle w:val="Heading3"/>
@@ -974,8 +974,8 @@
         <w:t xml:space="preserve">(~40 acteurs structurés). Pièces de récupération sur carcasses, prix attractif, volume limité.</w:t>
       </w:r>
     </w:p>
-    <w:bookmarkEnd w:id="24"/>
-    <w:bookmarkStart w:id="25" w:name="X54140778297c86bcbd2395be3c2127db8177753"/>
+    <w:bookmarkEnd w:id="13"/>
+    <w:bookmarkStart w:id="14" w:name="X54140778297c86bcbd2395be3c2127db8177753"/>
     <w:p>
       <w:pPr>
         <w:pStyle w:val="Heading3"/>
@@ -1315,9 +1315,9 @@
         </w:pict>
       </w:r>
     </w:p>
-    <w:bookmarkEnd w:id="25"/>
-    <w:bookmarkEnd w:id="26"/>
-    <w:bookmarkStart w:id="31" w:name="Xd2d69ded894dd15c2902f042ac5ab0a89812123"/>
+    <w:bookmarkEnd w:id="14"/>
+    <w:bookmarkEnd w:id="15"/>
+    <w:bookmarkStart w:id="20" w:name="Xd2d69ded894dd15c2902f042ac5ab0a89812123"/>
     <w:p>
       <w:pPr>
         <w:pStyle w:val="Heading2"/>
@@ -1326,7 +1326,7 @@
         <w:t xml:space="preserve">3. Concurrence — qui est là, qui ne l'est pas</w:t>
       </w:r>
     </w:p>
-    <w:bookmarkStart w:id="27" w:name="X45f6a74072689f3b639c72d5338081ab3900af2"/>
+    <w:bookmarkStart w:id="16" w:name="X45f6a74072689f3b639c72d5338081ab3900af2"/>
     <w:p>
       <w:pPr>
         <w:pStyle w:val="Heading3"/>
@@ -1436,8 +1436,8 @@
         <w:t xml:space="preserve">: pas de catalogue pièces, pas d'expertise verticale. Ne sont pas une menace à court terme mais pourraient acquérir un acteur établi à 24-36 mois.</w:t>
       </w:r>
     </w:p>
-    <w:bookmarkEnd w:id="27"/>
-    <w:bookmarkStart w:id="28" w:name="X08dd2cdf1c15784adfc30fa4ec6ccc1ceccdfd2"/>
+    <w:bookmarkEnd w:id="16"/>
+    <w:bookmarkStart w:id="17" w:name="X08dd2cdf1c15784adfc30fa4ec6ccc1ceccdfd2"/>
     <w:p>
       <w:pPr>
         <w:pStyle w:val="Heading3"/>
@@ -1512,8 +1512,8 @@
         <w:t xml:space="preserve">(Fleetio, Geotab) : trop chers, trop génériques, pas localisés (pas de FCFA, pas de fournisseurs CI, pas de FNE-CI).</w:t>
       </w:r>
     </w:p>
-    <w:bookmarkEnd w:id="28"/>
-    <w:bookmarkStart w:id="29" w:name="Xb5c0040416bc83eabb037b2ea9f5edf04d59ca3"/>
+    <w:bookmarkEnd w:id="17"/>
+    <w:bookmarkStart w:id="18" w:name="Xb5c0040416bc83eabb037b2ea9f5edf04d59ca3"/>
     <w:p>
       <w:pPr>
         <w:pStyle w:val="Heading3"/>
@@ -1566,8 +1566,8 @@
         <w:t xml:space="preserve">: concurrents sur la garantie constructeur, mais hors de prix pour les véhicules de plus de 5 ans (90% du parc). On capture ce qu'ils ne servent pas.</w:t>
       </w:r>
     </w:p>
-    <w:bookmarkEnd w:id="29"/>
-    <w:bookmarkStart w:id="30" w:name="Xa3383bf5768cc30fcd081592f069aab75a2dedf"/>
+    <w:bookmarkEnd w:id="18"/>
+    <w:bookmarkStart w:id="19" w:name="Xa3383bf5768cc30fcd081592f069aab75a2dedf"/>
     <w:p>
       <w:pPr>
         <w:pStyle w:val="Heading3"/>
@@ -1694,9 +1694,9 @@
         </w:pict>
       </w:r>
     </w:p>
-    <w:bookmarkEnd w:id="30"/>
-    <w:bookmarkEnd w:id="31"/>
-    <w:bookmarkStart w:id="35" w:name="Xa51ae0ced374a627eb985a01fae5adb16623b5f"/>
+    <w:bookmarkEnd w:id="19"/>
+    <w:bookmarkEnd w:id="20"/>
+    <w:bookmarkStart w:id="24" w:name="Xa51ae0ced374a627eb985a01fae5adb16623b5f"/>
     <w:p>
       <w:pPr>
         <w:pStyle w:val="Heading2"/>
@@ -1705,7 +1705,7 @@
         <w:t xml:space="preserve">4. Positionnement et proposition de valeur</w:t>
       </w:r>
     </w:p>
-    <w:bookmarkStart w:id="32" w:name="X211f8f57e9cad01e897c26d7d4804e17e296034"/>
+    <w:bookmarkStart w:id="21" w:name="X211f8f57e9cad01e897c26d7d4804e17e296034"/>
     <w:p>
       <w:pPr>
         <w:pStyle w:val="Heading3"/>
@@ -1824,8 +1824,8 @@
         <w:t xml:space="preserve">: « Tu gagnes une commission sur chaque vente que tu déclenches pour les vendeurs que tu as onboardés. »</w:t>
       </w:r>
     </w:p>
-    <w:bookmarkEnd w:id="32"/>
-    <w:bookmarkStart w:id="33" w:name="Xb35e53cce09a3e38b4659d923df6de13534139c"/>
+    <w:bookmarkEnd w:id="21"/>
+    <w:bookmarkStart w:id="22" w:name="Xb35e53cce09a3e38b4659d923df6de13534139c"/>
     <w:p>
       <w:pPr>
         <w:pStyle w:val="Heading3"/>
@@ -1933,8 +1933,8 @@
         <w:t xml:space="preserve">(escrow, garantie, facture normalisée DGI).</w:t>
       </w:r>
     </w:p>
-    <w:bookmarkEnd w:id="33"/>
-    <w:bookmarkStart w:id="34" w:name="X2cdbe38b05827046a4011804ff305a13de6877a"/>
+    <w:bookmarkEnd w:id="22"/>
+    <w:bookmarkStart w:id="23" w:name="X2cdbe38b05827046a4011804ff305a13de6877a"/>
     <w:p>
       <w:pPr>
         <w:pStyle w:val="Heading3"/>
@@ -2033,9 +2033,9 @@
         </w:pict>
       </w:r>
     </w:p>
-    <w:bookmarkEnd w:id="34"/>
-    <w:bookmarkEnd w:id="35"/>
-    <w:bookmarkStart w:id="41" w:name="X076f50ab137ddb315c545907b39c0180ecdc1ca"/>
+    <w:bookmarkEnd w:id="23"/>
+    <w:bookmarkEnd w:id="24"/>
+    <w:bookmarkStart w:id="30" w:name="X076f50ab137ddb315c545907b39c0180ecdc1ca"/>
     <w:p>
       <w:pPr>
         <w:pStyle w:val="Heading2"/>
@@ -2044,7 +2044,7 @@
         <w:t xml:space="preserve">5. La stratégie en 5 mouvements (24 mois)</w:t>
       </w:r>
     </w:p>
-    <w:bookmarkStart w:id="36" w:name="Xa1022c661079494230e5fd2ef22f35c7c3d96e3"/>
+    <w:bookmarkStart w:id="25" w:name="Xa1022c661079494230e5fd2ef22f35c7c3d96e3"/>
     <w:p>
       <w:pPr>
         <w:pStyle w:val="Heading3"/>
@@ -2175,8 +2175,8 @@
         <w:t xml:space="preserve">: 150+ commandes/jour à fin M3, 350+ à fin M6.</w:t>
       </w:r>
     </w:p>
-    <w:bookmarkEnd w:id="36"/>
-    <w:bookmarkStart w:id="37" w:name="X604f7bb6dce60abd3d0ef62cfe2ea6fe29f3028"/>
+    <w:bookmarkEnd w:id="25"/>
+    <w:bookmarkStart w:id="26" w:name="X604f7bb6dce60abd3d0ef62cfe2ea6fe29f3028"/>
     <w:p>
       <w:pPr>
         <w:pStyle w:val="Heading3"/>
@@ -2327,8 +2327,8 @@
         <w:t xml:space="preserve">: 500 véhicules sous abonnement à M9, 1 500 à M12, churn &lt; 5%/mois.</w:t>
       </w:r>
     </w:p>
-    <w:bookmarkEnd w:id="37"/>
-    <w:bookmarkStart w:id="38" w:name="Xb65c934d831f9cdb63b1fea6b46114a3258f94c"/>
+    <w:bookmarkEnd w:id="26"/>
+    <w:bookmarkStart w:id="27" w:name="Xb65c934d831f9cdb63b1fea6b46114a3258f94c"/>
     <w:p>
       <w:pPr>
         <w:pStyle w:val="Heading3"/>
@@ -2465,8 +2465,8 @@
         <w:t xml:space="preserve">: 5 000 factures FNE-CI émises à M12, 25 000 à M15.</w:t>
       </w:r>
     </w:p>
-    <w:bookmarkEnd w:id="38"/>
-    <w:bookmarkStart w:id="39" w:name="Xd84e98ba68735eada0cfed14204a82b3143463f"/>
+    <w:bookmarkEnd w:id="27"/>
+    <w:bookmarkStart w:id="28" w:name="Xd84e98ba68735eada0cfed14204a82b3143463f"/>
     <w:p>
       <w:pPr>
         <w:pStyle w:val="Heading3"/>
@@ -2559,8 +2559,8 @@
         <w:t xml:space="preserve">Offre transport collectif (UNATRCI, syndicats gbaka) : pricing tier intermédiaire, paiement groupé syndical.</w:t>
       </w:r>
     </w:p>
-    <w:bookmarkEnd w:id="39"/>
-    <w:bookmarkStart w:id="40" w:name="Xb85b14ad853b70698f58bc87ccac1759e191d02"/>
+    <w:bookmarkEnd w:id="28"/>
+    <w:bookmarkStart w:id="29" w:name="Xb85b14ad853b70698f58bc87ccac1759e191d02"/>
     <w:p>
       <w:pPr>
         <w:pStyle w:val="Heading3"/>
@@ -2666,9 +2666,9 @@
         </w:pict>
       </w:r>
     </w:p>
-    <w:bookmarkEnd w:id="40"/>
-    <w:bookmarkEnd w:id="41"/>
-    <w:bookmarkStart w:id="45" w:name="Xa81a8ec7edad8896f41af6303d6148e9f2a6336"/>
+    <w:bookmarkEnd w:id="29"/>
+    <w:bookmarkEnd w:id="30"/>
+    <w:bookmarkStart w:id="34" w:name="Xa81a8ec7edad8896f41af6303d6148e9f2a6336"/>
     <w:p>
       <w:pPr>
         <w:pStyle w:val="Heading2"/>
@@ -2677,7 +2677,7 @@
         <w:t xml:space="preserve">6. Modèle économique — comment Pièces gagne de l'argent</w:t>
       </w:r>
     </w:p>
-    <w:bookmarkStart w:id="42" w:name="X5c66d5d9885df1772825564efef71a1ad222843"/>
+    <w:bookmarkStart w:id="31" w:name="X5c66d5d9885df1772825564efef71a1ad222843"/>
     <w:p>
       <w:pPr>
         <w:pStyle w:val="Heading3"/>
@@ -2876,8 +2876,8 @@
         </w:tc>
       </w:tr>
     </w:tbl>
-    <w:bookmarkEnd w:id="42"/>
-    <w:bookmarkStart w:id="43" w:name="X7fd7804bc8b5e125ed35978acca4c5bef1bd56c"/>
+    <w:bookmarkEnd w:id="31"/>
+    <w:bookmarkStart w:id="32" w:name="X7fd7804bc8b5e125ed35978acca4c5bef1bd56c"/>
     <w:p>
       <w:pPr>
         <w:pStyle w:val="Heading3"/>
@@ -2996,8 +2996,8 @@
         <w:t xml:space="preserve">: &gt; 4 sur tous les segments dès M12.</w:t>
       </w:r>
     </w:p>
-    <w:bookmarkEnd w:id="43"/>
-    <w:bookmarkStart w:id="44" w:name="X7fa8afa9aad2a0b8d7d96539a0c0f4287ea7247"/>
+    <w:bookmarkEnd w:id="32"/>
+    <w:bookmarkStart w:id="33" w:name="X7fa8afa9aad2a0b8d7d96539a0c0f4287ea7247"/>
     <w:p>
       <w:pPr>
         <w:pStyle w:val="Heading3"/>
@@ -3061,9 +3061,9 @@
         </w:pict>
       </w:r>
     </w:p>
-    <w:bookmarkEnd w:id="44"/>
-    <w:bookmarkEnd w:id="45"/>
-    <w:bookmarkStart w:id="49" w:name="X4a34cc10c32c7fcafed93dbeeab3db6c110b222"/>
+    <w:bookmarkEnd w:id="33"/>
+    <w:bookmarkEnd w:id="34"/>
+    <w:bookmarkStart w:id="38" w:name="X4a34cc10c32c7fcafed93dbeeab3db6c110b222"/>
     <w:p>
       <w:pPr>
         <w:pStyle w:val="Heading2"/>
@@ -3072,7 +3072,7 @@
         <w:t xml:space="preserve">7. GTM — go-to-market opérationnel</w:t>
       </w:r>
     </w:p>
-    <w:bookmarkStart w:id="46" w:name="X9cc70b76dcbe75e2cdf8c637165478c2ef50f00"/>
+    <w:bookmarkStart w:id="35" w:name="X9cc70b76dcbe75e2cdf8c637165478c2ef50f00"/>
     <w:p>
       <w:pPr>
         <w:pStyle w:val="Heading3"/>
@@ -3210,8 +3210,8 @@
         <w:t xml:space="preserve">Programme de parrainage vendeur → vendeur (5 000 F par vendeur amené qui fait sa première vente).</w:t>
       </w:r>
     </w:p>
-    <w:bookmarkEnd w:id="46"/>
-    <w:bookmarkStart w:id="47" w:name="Xa15e8b492b3365d5ceba4d0e8d1b0a275047e12"/>
+    <w:bookmarkEnd w:id="35"/>
+    <w:bookmarkStart w:id="36" w:name="Xa15e8b492b3365d5ceba4d0e8d1b0a275047e12"/>
     <w:p>
       <w:pPr>
         <w:pStyle w:val="Heading3"/>
@@ -3319,8 +3319,8 @@
         <w:t xml:space="preserve">(les Liaisons recommandent Pièces aux mécaniciens qu'ils croisent en cantine).</w:t>
       </w:r>
     </w:p>
-    <w:bookmarkEnd w:id="47"/>
-    <w:bookmarkStart w:id="48" w:name="X1ab38090f5863a840116a3b3a28145788034b90"/>
+    <w:bookmarkEnd w:id="36"/>
+    <w:bookmarkStart w:id="37" w:name="X1ab38090f5863a840116a3b3a28145788034b90"/>
     <w:p>
       <w:pPr>
         <w:pStyle w:val="Heading3"/>
@@ -3468,9 +3468,9 @@
         </w:pict>
       </w:r>
     </w:p>
-    <w:bookmarkEnd w:id="48"/>
-    <w:bookmarkEnd w:id="49"/>
-    <w:bookmarkStart w:id="53" w:name="X24bc5f9db31a5adbf29bd3cb129e6e5ccc50062"/>
+    <w:bookmarkEnd w:id="37"/>
+    <w:bookmarkEnd w:id="38"/>
+    <w:bookmarkStart w:id="42" w:name="X24bc5f9db31a5adbf29bd3cb129e6e5ccc50062"/>
     <w:p>
       <w:pPr>
         <w:pStyle w:val="Heading2"/>
@@ -3479,7 +3479,7 @@
         <w:t xml:space="preserve">8. Organisation cible — équipe à 12, 24 et 36 mois</w:t>
       </w:r>
     </w:p>
-    <w:bookmarkStart w:id="50" w:name="Xdcf3a7ca454681044c019b58f1d8f8d9a3ec579"/>
+    <w:bookmarkStart w:id="39" w:name="Xdcf3a7ca454681044c019b58f1d8f8d9a3ec579"/>
     <w:p>
       <w:pPr>
         <w:pStyle w:val="Heading3"/>
@@ -3748,8 +3748,8 @@
         </w:tc>
       </w:tr>
     </w:tbl>
-    <w:bookmarkEnd w:id="50"/>
-    <w:bookmarkStart w:id="51" w:name="X1add776e5141a0e3931fa8dc2332a865cfb9ca8"/>
+    <w:bookmarkEnd w:id="39"/>
+    <w:bookmarkStart w:id="40" w:name="X1add776e5141a0e3931fa8dc2332a865cfb9ca8"/>
     <w:p>
       <w:pPr>
         <w:pStyle w:val="Heading3"/>
@@ -3826,8 +3826,8 @@
         <w:t xml:space="preserve">Doublement Liaison et commercial.</w:t>
       </w:r>
     </w:p>
-    <w:bookmarkEnd w:id="51"/>
-    <w:bookmarkStart w:id="52" w:name="Xb0676059d508a7bec0efc8669030c05f91c18cb"/>
+    <w:bookmarkEnd w:id="40"/>
+    <w:bookmarkStart w:id="41" w:name="Xb0676059d508a7bec0efc8669030c05f91c18cb"/>
     <w:p>
       <w:pPr>
         <w:pStyle w:val="Heading3"/>
@@ -3931,9 +3931,9 @@
         </w:pict>
       </w:r>
     </w:p>
-    <w:bookmarkEnd w:id="52"/>
-    <w:bookmarkEnd w:id="53"/>
-    <w:bookmarkStart w:id="57" w:name="X593eea8d4480f240afae1cc23ec216a87c8ebf9"/>
+    <w:bookmarkEnd w:id="41"/>
+    <w:bookmarkEnd w:id="42"/>
+    <w:bookmarkStart w:id="46" w:name="X593eea8d4480f240afae1cc23ec216a87c8ebf9"/>
     <w:p>
       <w:pPr>
         <w:pStyle w:val="Heading2"/>
@@ -3942,7 +3942,7 @@
         <w:t xml:space="preserve">9. Financement — combien, quand, pour quoi</w:t>
       </w:r>
     </w:p>
-    <w:bookmarkStart w:id="54" w:name="Xf862580d9d9f9a171b2ec51fa16fbc457b2b3d8"/>
+    <w:bookmarkStart w:id="43" w:name="Xf862580d9d9f9a171b2ec51fa16fbc457b2b3d8"/>
     <w:p>
       <w:pPr>
         <w:pStyle w:val="Heading3"/>
@@ -4019,8 +4019,8 @@
         <w:t xml:space="preserve">Affectation : expansion nationale et sous-régionale, BTP/corporate, FNE-CI scale.</w:t>
       </w:r>
     </w:p>
-    <w:bookmarkEnd w:id="54"/>
-    <w:bookmarkStart w:id="55" w:name="Xe49fb0a1ad84adb40fc1cf6704dd4bfdf6ff955"/>
+    <w:bookmarkEnd w:id="43"/>
+    <w:bookmarkStart w:id="44" w:name="Xe49fb0a1ad84adb40fc1cf6704dd4bfdf6ff955"/>
     <w:p>
       <w:pPr>
         <w:pStyle w:val="Heading3"/>
@@ -4089,8 +4089,8 @@
         <w:t xml:space="preserve">Churn flotte &lt; 5%/mois.</w:t>
       </w:r>
     </w:p>
-    <w:bookmarkEnd w:id="55"/>
-    <w:bookmarkStart w:id="56" w:name="Xe043c9ea8ab228e350bc1ff5f20eaa2791731a5"/>
+    <w:bookmarkEnd w:id="44"/>
+    <w:bookmarkStart w:id="45" w:name="Xe043c9ea8ab228e350bc1ff5f20eaa2791731a5"/>
     <w:p>
       <w:pPr>
         <w:pStyle w:val="Heading3"/>
@@ -4172,9 +4172,9 @@
         </w:pict>
       </w:r>
     </w:p>
-    <w:bookmarkEnd w:id="56"/>
-    <w:bookmarkEnd w:id="57"/>
-    <w:bookmarkStart w:id="58" w:name="X2b53c5a34afa5a68e084293b26a7f83655ebc84"/>
+    <w:bookmarkEnd w:id="45"/>
+    <w:bookmarkEnd w:id="46"/>
+    <w:bookmarkStart w:id="47" w:name="X2b53c5a34afa5a68e084293b26a7f83655ebc84"/>
     <w:p>
       <w:pPr>
         <w:pStyle w:val="Heading2"/>
@@ -4794,8 +4794,8 @@
         </w:pict>
       </w:r>
     </w:p>
-    <w:bookmarkEnd w:id="58"/>
-    <w:bookmarkStart w:id="62" w:name="Xfc9c688d1163d4bf09bdf4f87dd9b44c45bcf94"/>
+    <w:bookmarkEnd w:id="47"/>
+    <w:bookmarkStart w:id="51" w:name="Xfc9c688d1163d4bf09bdf4f87dd9b44c45bcf94"/>
     <w:p>
       <w:pPr>
         <w:pStyle w:val="Heading2"/>
@@ -4804,7 +4804,7 @@
         <w:t xml:space="preserve">11. KPIs — le dashboard CEO</w:t>
       </w:r>
     </w:p>
-    <w:bookmarkStart w:id="59" w:name="Xb116fcd2687239f6adcb4b3737d9db5ab7c2cc0"/>
+    <w:bookmarkStart w:id="48" w:name="Xb116fcd2687239f6adcb4b3737d9db5ab7c2cc0"/>
     <w:p>
       <w:pPr>
         <w:pStyle w:val="Heading3"/>
@@ -4873,8 +4873,8 @@
         <w:t xml:space="preserve">Cash en banque, runway projeté.</w:t>
       </w:r>
     </w:p>
-    <w:bookmarkEnd w:id="59"/>
-    <w:bookmarkStart w:id="60" w:name="Xa128e8f828b8d864fd5fae1cebae033023048f9"/>
+    <w:bookmarkEnd w:id="48"/>
+    <w:bookmarkStart w:id="49" w:name="Xa128e8f828b8d864fd5fae1cebae033023048f9"/>
     <w:p>
       <w:pPr>
         <w:pStyle w:val="Heading3"/>
@@ -4967,8 +4967,8 @@
         <w:t xml:space="preserve">Disputes ouvertes / résolues, taux de fraude.</w:t>
       </w:r>
     </w:p>
-    <w:bookmarkEnd w:id="60"/>
-    <w:bookmarkStart w:id="61" w:name="Xbc31cc420dbef19fbc1f31687be12296c70982f"/>
+    <w:bookmarkEnd w:id="49"/>
+    <w:bookmarkStart w:id="50" w:name="Xbc31cc420dbef19fbc1f31687be12296c70982f"/>
     <w:p>
       <w:pPr>
         <w:pStyle w:val="Heading3"/>
@@ -5044,9 +5044,9 @@
         </w:pict>
       </w:r>
     </w:p>
-    <w:bookmarkEnd w:id="61"/>
-    <w:bookmarkEnd w:id="62"/>
-    <w:bookmarkStart w:id="66" w:name="Xb4676d605a51ba097b847dca5484a484cdbadb9"/>
+    <w:bookmarkEnd w:id="50"/>
+    <w:bookmarkEnd w:id="51"/>
+    <w:bookmarkStart w:id="55" w:name="Xb4676d605a51ba097b847dca5484a484cdbadb9"/>
     <w:p>
       <w:pPr>
         <w:pStyle w:val="Heading2"/>
@@ -5055,7 +5055,7 @@
         <w:t xml:space="preserve">12. Gouvernance — comment décider</w:t>
       </w:r>
     </w:p>
-    <w:bookmarkStart w:id="63" w:name="Xb2c5dec2c5270899f8712643926c709911e8af2"/>
+    <w:bookmarkStart w:id="52" w:name="Xb2c5dec2c5270899f8712643926c709911e8af2"/>
     <w:p>
       <w:pPr>
         <w:pStyle w:val="Heading3"/>
@@ -5152,8 +5152,8 @@
         <w:t xml:space="preserve">(1.5 jour) revue mouvements 1-5, ajustement roadmap.</w:t>
       </w:r>
     </w:p>
-    <w:bookmarkEnd w:id="63"/>
-    <w:bookmarkStart w:id="64" w:name="X9cd96ea2403ee89f7d668b8637f5d9e89d423fd"/>
+    <w:bookmarkEnd w:id="52"/>
+    <w:bookmarkStart w:id="53" w:name="X9cd96ea2403ee89f7d668b8637f5d9e89d423fd"/>
     <w:p>
       <w:pPr>
         <w:pStyle w:val="Heading3"/>
@@ -5272,8 +5272,8 @@
         <w:t xml:space="preserve">: CEO + Board approval.</w:t>
       </w:r>
     </w:p>
-    <w:bookmarkEnd w:id="64"/>
-    <w:bookmarkStart w:id="65" w:name="X87aaa63aeefdb9d32087aab78b9895e3f2799b9"/>
+    <w:bookmarkEnd w:id="53"/>
+    <w:bookmarkStart w:id="54" w:name="X87aaa63aeefdb9d32087aab78b9895e3f2799b9"/>
     <w:p>
       <w:pPr>
         <w:pStyle w:val="Heading3"/>
@@ -5301,9 +5301,9 @@
         </w:pict>
       </w:r>
     </w:p>
-    <w:bookmarkEnd w:id="65"/>
-    <w:bookmarkEnd w:id="66"/>
-    <w:bookmarkStart w:id="71" w:name="X37e16ef4ff2676dddc4cdd6b3f400ef781962dc"/>
+    <w:bookmarkEnd w:id="54"/>
+    <w:bookmarkEnd w:id="55"/>
+    <w:bookmarkStart w:id="60" w:name="X37e16ef4ff2676dddc4cdd6b3f400ef781962dc"/>
     <w:p>
       <w:pPr>
         <w:pStyle w:val="Heading2"/>
@@ -5312,7 +5312,7 @@
         <w:t xml:space="preserve">13. Marque, communication, image publique</w:t>
       </w:r>
     </w:p>
-    <w:bookmarkStart w:id="67" w:name="Xa6cc849612e0d6bdef22e3c36e57e52d2863f77"/>
+    <w:bookmarkStart w:id="56" w:name="Xa6cc849612e0d6bdef22e3c36e57e52d2863f77"/>
     <w:p>
       <w:pPr>
         <w:pStyle w:val="Heading3"/>
@@ -5337,8 +5337,8 @@
         <w:t xml:space="preserve">Décliné B2B : « Pièces — votre flotte, votre coût, votre contrôle. »</w:t>
       </w:r>
     </w:p>
-    <w:bookmarkEnd w:id="67"/>
-    <w:bookmarkStart w:id="68" w:name="Xd60af454fb754a5a077be3f03ee8423e8caad79"/>
+    <w:bookmarkEnd w:id="56"/>
+    <w:bookmarkStart w:id="57" w:name="Xd60af454fb754a5a077be3f03ee8423e8caad79"/>
     <w:p>
       <w:pPr>
         <w:pStyle w:val="Heading3"/>
@@ -5367,8 +5367,8 @@
         <w:t xml:space="preserve">. Règles d'or : transparence (chips condition), clarté (breakdown), franc-parler en français ivoirien acceptable (pas trop institutionnel pour le canal mécanicien, plus sobre pour le B2B).</w:t>
       </w:r>
     </w:p>
-    <w:bookmarkEnd w:id="68"/>
-    <w:bookmarkStart w:id="69" w:name="Xd128178b9e4c46ccb1daabba4c8b7a740a4070b"/>
+    <w:bookmarkEnd w:id="57"/>
+    <w:bookmarkStart w:id="58" w:name="Xd128178b9e4c46ccb1daabba4c8b7a740a4070b"/>
     <w:p>
       <w:pPr>
         <w:pStyle w:val="Heading3"/>
@@ -5429,8 +5429,8 @@
         <w:t xml:space="preserve">Adhésion CGECI, JCI Côte d'Ivoire, GAPI. Présence visible aux événements ministère Transports, ministère Commerce.</w:t>
       </w:r>
     </w:p>
-    <w:bookmarkEnd w:id="69"/>
-    <w:bookmarkStart w:id="70" w:name="X12a59c7ef80c7916f0ff1c8631cc791a935b646"/>
+    <w:bookmarkEnd w:id="58"/>
+    <w:bookmarkStart w:id="59" w:name="X12a59c7ef80c7916f0ff1c8631cc791a935b646"/>
     <w:p>
       <w:pPr>
         <w:pStyle w:val="Heading3"/>
@@ -5470,9 +5470,9 @@
         </w:pict>
       </w:r>
     </w:p>
-    <w:bookmarkEnd w:id="70"/>
-    <w:bookmarkEnd w:id="71"/>
-    <w:bookmarkStart w:id="75" w:name="X4a40e63ceaae4c0919c2fc20b00892e906041f7"/>
+    <w:bookmarkEnd w:id="59"/>
+    <w:bookmarkEnd w:id="60"/>
+    <w:bookmarkStart w:id="64" w:name="X4a40e63ceaae4c0919c2fc20b00892e906041f7"/>
     <w:p>
       <w:pPr>
         <w:pStyle w:val="Heading2"/>
@@ -5481,7 +5481,7 @@
         <w:t xml:space="preserve">14. Conformité et risques légaux</w:t>
       </w:r>
     </w:p>
-    <w:bookmarkStart w:id="72" w:name="X567cc01974def157ee1e22e71a916609e0d2694"/>
+    <w:bookmarkStart w:id="61" w:name="X567cc01974def157ee1e22e71a916609e0d2694"/>
     <w:p>
       <w:pPr>
         <w:pStyle w:val="Heading3"/>
@@ -5514,8 +5514,8 @@
         <w:t xml:space="preserve">Holding sous-régionale envisageable à M24 pour expansion Sénégal / Bénin.</w:t>
       </w:r>
     </w:p>
-    <w:bookmarkEnd w:id="72"/>
-    <w:bookmarkStart w:id="73" w:name="X0ad535d1627f7e42faff995b7777f39e4e6ba41"/>
+    <w:bookmarkEnd w:id="61"/>
+    <w:bookmarkStart w:id="62" w:name="X0ad535d1627f7e42faff995b7777f39e4e6ba41"/>
     <w:p>
       <w:pPr>
         <w:pStyle w:val="Heading3"/>
@@ -5634,8 +5634,8 @@
         <w:t xml:space="preserve">: partenariats agréés (CinetPay agréé, OM, MTN, Wave directs à étudier).</w:t>
       </w:r>
     </w:p>
-    <w:bookmarkEnd w:id="73"/>
-    <w:bookmarkStart w:id="74" w:name="X58d3ab2fa0979a402a63b97ba715836b96db79c"/>
+    <w:bookmarkEnd w:id="62"/>
+    <w:bookmarkStart w:id="63" w:name="X58d3ab2fa0979a402a63b97ba715836b96db79c"/>
     <w:p>
       <w:pPr>
         <w:pStyle w:val="Heading3"/>
@@ -5711,9 +5711,9 @@
         </w:pict>
       </w:r>
     </w:p>
-    <w:bookmarkEnd w:id="74"/>
-    <w:bookmarkEnd w:id="75"/>
-    <w:bookmarkStart w:id="80" w:name="X5ff9242d6781c90c8e6c52f4743fb3e410053ed"/>
+    <w:bookmarkEnd w:id="63"/>
+    <w:bookmarkEnd w:id="64"/>
+    <w:bookmarkStart w:id="69" w:name="X5ff9242d6781c90c8e6c52f4743fb3e410053ed"/>
     <w:p>
       <w:pPr>
         <w:pStyle w:val="Heading2"/>
@@ -5722,7 +5722,7 @@
         <w:t xml:space="preserve">15. Roadmap produit — vue CEO (détails CTO Bible)</w:t>
       </w:r>
     </w:p>
-    <w:bookmarkStart w:id="76" w:name="Xb8df14f0763cfd70a41bbd4017b51cc2212b6f1"/>
+    <w:bookmarkStart w:id="65" w:name="Xb8df14f0763cfd70a41bbd4017b51cc2212b6f1"/>
     <w:p>
       <w:pPr>
         <w:pStyle w:val="Heading3"/>
@@ -5779,8 +5779,8 @@
         <w:t xml:space="preserve">Bot WhatsApp officiel (onboarding mécanicien, recherche pièce, suivi commande).</w:t>
       </w:r>
     </w:p>
-    <w:bookmarkEnd w:id="76"/>
-    <w:bookmarkStart w:id="77" w:name="X0bc070c58935ebfd6b301c9a7cb5de5ab9ce5b1"/>
+    <w:bookmarkEnd w:id="65"/>
+    <w:bookmarkStart w:id="66" w:name="X0bc070c58935ebfd6b301c9a7cb5de5ab9ce5b1"/>
     <w:p>
       <w:pPr>
         <w:pStyle w:val="Heading3"/>
@@ -5837,8 +5837,8 @@
         <w:t xml:space="preserve">API publique flotte (Yango, Heetch, Treepz).</w:t>
       </w:r>
     </w:p>
-    <w:bookmarkEnd w:id="77"/>
-    <w:bookmarkStart w:id="78" w:name="X6c703f757c73cc937f99c8704ef486ca25a34de"/>
+    <w:bookmarkEnd w:id="66"/>
+    <w:bookmarkStart w:id="67" w:name="X6c703f757c73cc937f99c8704ef486ca25a34de"/>
     <w:p>
       <w:pPr>
         <w:pStyle w:val="Heading3"/>
@@ -5895,8 +5895,8 @@
         <w:t xml:space="preserve">Marketplace main-d'œuvre (réseau garages affiliés) — à arbitrer M12 si focus pièces tient.</w:t>
       </w:r>
     </w:p>
-    <w:bookmarkEnd w:id="78"/>
-    <w:bookmarkStart w:id="79" w:name="Xa364296760401cfcfeb394be2d9f0ef269ae65e"/>
+    <w:bookmarkEnd w:id="67"/>
+    <w:bookmarkStart w:id="68" w:name="Xa364296760401cfcfeb394be2d9f0ef269ae65e"/>
     <w:p>
       <w:pPr>
         <w:pStyle w:val="Heading3"/>
@@ -5948,9 +5948,9 @@
         </w:pict>
       </w:r>
     </w:p>
-    <w:bookmarkEnd w:id="79"/>
-    <w:bookmarkEnd w:id="80"/>
-    <w:bookmarkStart w:id="81" w:name="X442d85207afe55442dc52d86f09fe733e6105f3"/>
+    <w:bookmarkEnd w:id="68"/>
+    <w:bookmarkEnd w:id="69"/>
+    <w:bookmarkStart w:id="70" w:name="X442d85207afe55442dc52d86f09fe733e6105f3"/>
     <w:p>
       <w:pPr>
         <w:pStyle w:val="Heading2"/>
@@ -6168,8 +6168,8 @@
         </w:pict>
       </w:r>
     </w:p>
-    <w:bookmarkEnd w:id="81"/>
-    <w:bookmarkStart w:id="82" w:name="X5d5e7c3dca51020e0044f9ad461dba9d5242de0"/>
+    <w:bookmarkEnd w:id="70"/>
+    <w:bookmarkStart w:id="71" w:name="X5d5e7c3dca51020e0044f9ad461dba9d5242de0"/>
     <w:p>
       <w:pPr>
         <w:pStyle w:val="Heading2"/>
@@ -6405,8 +6405,8 @@
         </w:pict>
       </w:r>
     </w:p>
-    <w:bookmarkEnd w:id="82"/>
-    <w:bookmarkStart w:id="83" w:name="X44e6735b00e4e32432cf055c09e9a26c4859220"/>
+    <w:bookmarkEnd w:id="71"/>
+    <w:bookmarkStart w:id="72" w:name="X44e6735b00e4e32432cf055c09e9a26c4859220"/>
     <w:p>
       <w:pPr>
         <w:pStyle w:val="Heading2"/>
@@ -6570,7 +6570,7 @@
         <w:rPr>
           <w:rStyle w:val="VerbatimChar"/>
         </w:rPr>
-        <w:t xml:space="preserve">brochure-commerciale-entreprises-2026-05-27</w:t>
+        <w:t xml:space="preserve">brochure-commerciale-entreprises-2026-06-03</w:t>
       </w:r>
       <w:r>
         <w:t xml:space="preserve">,</w:t>
@@ -6677,9 +6677,13 @@
         <w:t xml:space="preserve">Document interne · Handover CEO · v1.0 · 28 mai 2026.</w:t>
       </w:r>
     </w:p>
-    <w:bookmarkEnd w:id="83"/>
-    <w:bookmarkEnd w:id="84"/>
-    <w:sectPr/>
+    <w:bookmarkEnd w:id="72"/>
+    <w:bookmarkEnd w:id="73"/>
+    <w:sectPr>
+      <w:footnotePr>
+        <w:numRestart w:val="eachSect"/>
+      </w:footnotePr>
+    </w:sectPr>
   </w:body>
 </w:document>
 </file>
@@ -7299,10 +7303,10 @@
   <w:docDefaults>
     <w:rPrDefault>
       <w:rPr>
-        <w:rFonts w:asciiTheme="minorHAnsi" w:cstheme="minorBidi" w:eastAsiaTheme="minorHAnsi" w:hAnsiTheme="minorHAnsi"/>
+        <w:rFonts w:asciiTheme="minorHAnsi" w:cstheme="minorBidi" w:eastAsiaTheme="minorEastAsia" w:hAnsiTheme="minorHAnsi"/>
         <w:sz w:val="24"/>
         <w:szCs w:val="24"/>
-        <w:lang w:bidi="ar-SA" w:eastAsia="en-US" w:val="en-US"/>
+        <w:lang w:bidi="ar-SA" w:eastAsia="zh-CN" w:val="en-US"/>
       </w:rPr>
     </w:rPrDefault>
     <w:pPrDefault>
@@ -7354,8 +7358,6 @@
     </w:pPr>
     <w:rPr>
       <w:rFonts w:asciiTheme="majorHAnsi" w:cstheme="majorBidi" w:eastAsiaTheme="majorEastAsia" w:hAnsiTheme="majorHAnsi"/>
-      <w:spacing w:val="-10"/>
-      <w:kern w:val="28"/>
       <w:sz w:val="56"/>
       <w:szCs w:val="56"/>
     </w:rPr>
@@ -7368,8 +7370,6 @@
     <w:rsid w:val="00A10FD9"/>
     <w:rPr>
       <w:rFonts w:asciiTheme="majorHAnsi" w:cstheme="majorBidi" w:eastAsiaTheme="majorEastAsia" w:hAnsiTheme="majorHAnsi"/>
-      <w:spacing w:val="-10"/>
-      <w:kern w:val="28"/>
       <w:sz w:val="56"/>
       <w:szCs w:val="56"/>
     </w:rPr>
@@ -7410,23 +7410,31 @@
   </w:style>
   <w:style w:customStyle="1" w:styleId="Author" w:type="paragraph">
     <w:name w:val="Author"/>
+    <w:basedOn w:val="Title"/>
     <w:next w:val="BodyText"/>
     <w:qFormat/>
     <w:pPr>
       <w:keepNext/>
       <w:keepLines/>
-      <w:jc w:val="center"/>
     </w:pPr>
+    <w:rPr>
+      <w:sz w:val="24"/>
+      <w:szCs w:val="24"/>
+    </w:rPr>
   </w:style>
   <w:style w:styleId="Date" w:type="paragraph">
     <w:name w:val="Date"/>
+    <w:basedOn w:val="Title"/>
     <w:next w:val="BodyText"/>
     <w:qFormat/>
     <w:pPr>
       <w:keepNext/>
       <w:keepLines/>
-      <w:jc w:val="center"/>
     </w:pPr>
+    <w:rPr>
+      <w:sz w:val="24"/>
+      <w:szCs w:val="24"/>
+    </w:rPr>
   </w:style>
   <w:style w:customStyle="1" w:styleId="AbstractTitle" w:type="paragraph">
     <w:name w:val="Abstract Title"/>
@@ -7839,13 +7847,6 @@
       </w:tblCellMar>
     </w:tblPr>
     <w:tblStylePr w:type="firstRow">
-      <w:tblPr>
-        <w:jc w:val="left"/>
-        <w:tblInd w:type="dxa" w:w="0"/>
-      </w:tblPr>
-      <w:trPr>
-        <w:jc w:val="left"/>
-      </w:trPr>
       <w:tcPr>
         <w:tcBorders>
           <w:bottom w:val="single"/>

</xml_diff>

<commit_message>
docs: plan d'affaires + pitch deck Seed ; retire les études pricing
- Nouveau plan d'affaires complet (marché sourcé, modèle, projections 3 ans,
  dimensionnement levée Seed ~1,5 M USD, emploi des fonds, jalons Série A)
- Nouveau pitch deck investisseur (13 slides, une par page)
- Données marché actualisées par recherche web : VTC ~6-8k (départ Uber 2025,
  Yango dominant), parc national ~1,2 M, marché pièces ~210 Mds F, climat Seed 2025
- Suppression de pricing-flotte-2026-05 et -27 (pré-lancement, non pertinents)
- CEO_BIBLE : référence pricing supprimée, pointe vers le plan d'affaires
- Enregistrés dans build.sh + index.md (section Stratégie & financement)

Co-Authored-By: Claude Opus 4.8 (1M context) <noreply@anthropic.com>
</commit_message>
<xml_diff>
--- a/docs/CEO_BIBLE.docx
+++ b/docs/CEO_BIBLE.docx
@@ -6552,12 +6552,21 @@
         <w:pStyle w:val="FirstParagraph"/>
       </w:pPr>
       <w:r>
-        <w:t xml:space="preserve">Tout le reste — produit, ops, finance — est documenté ici, dans la CTO Bible, dans DESIGN.md, et dans les brochures commerciales (</w:t>
+        <w:t xml:space="preserve">Tout le reste — produit, ops, finance — est documenté ici, dans la CTO Bible, dans DESIGN.md, dans le plan d'affaires (</w:t>
       </w:r>
       <w:r>
         <w:rPr>
           <w:rStyle w:val="VerbatimChar"/>
         </w:rPr>
+        <w:t xml:space="preserve">plan-affaires-pieces-2026-06</w:t>
+      </w:r>
+      <w:r>
+        <w:t xml:space="preserve">), et dans les brochures commerciales (</w:t>
+      </w:r>
+      <w:r>
+        <w:rPr>
+          <w:rStyle w:val="VerbatimChar"/>
+        </w:rPr>
         <w:t xml:space="preserve">brochure-commerciale-pieces</w:t>
       </w:r>
       <w:r>
@@ -6582,7 +6591,7 @@
         <w:rPr>
           <w:rStyle w:val="VerbatimChar"/>
         </w:rPr>
-        <w:t xml:space="preserve">brochure-vtc-grand-compte-2026-05</w:t>
+        <w:t xml:space="preserve">brochure-vtc-grand-compte-2026-06-03</w:t>
       </w:r>
       <w:r>
         <w:t xml:space="preserve">,</w:t>
@@ -6606,7 +6615,7 @@
         <w:rPr>
           <w:rStyle w:val="VerbatimChar"/>
         </w:rPr>
-        <w:t xml:space="preserve">offre-vtc-6000-vehicules-2026-05</w:t>
+        <w:t xml:space="preserve">offre-vtc-6000-vehicules-2026-06-03</w:t>
       </w:r>
       <w:r>
         <w:t xml:space="preserve">,</w:t>
@@ -6619,18 +6628,6 @@
           <w:rStyle w:val="VerbatimChar"/>
         </w:rPr>
         <w:t xml:space="preserve">offre-btp-800-vehicules-2026-05</w:t>
-      </w:r>
-      <w:r>
-        <w:t xml:space="preserve">,</w:t>
-      </w:r>
-      <w:r>
-        <w:t xml:space="preserve"> </w:t>
-      </w:r>
-      <w:r>
-        <w:rPr>
-          <w:rStyle w:val="VerbatimChar"/>
-        </w:rPr>
-        <w:t xml:space="preserve">pricing-flotte-2026-05-27</w:t>
       </w:r>
       <w:r>
         <w:t xml:space="preserve">).</w:t>

</xml_diff>

<commit_message>
docs: remplace « cantine(s) » par « magasin(s) » (plan, deck, CEO_BIBLE)
Co-Authored-By: Claude Opus 4.8 (1M context) <noreply@anthropic.com>
</commit_message>
<xml_diff>
--- a/docs/CEO_BIBLE.docx
+++ b/docs/CEO_BIBLE.docx
@@ -163,7 +163,7 @@
         <w:t xml:space="preserve">massif, fragmenté, opaque, et 100% informel</w:t>
       </w:r>
       <w:r>
-        <w:t xml:space="preserve">. À Adjamé, Yopougon, Marcory, Koumassi, des milliers de vendeurs vendent des pièces neuves, d'occasion importées (Japon, Dubai), ré-usinées et aftermarket — sans catalogue, sans prix affichés, sans garantie, sans facture, sans traçabilité. Le mécanicien perd 2 à 4 heures par pièce à faire le tour des cantines. Le propriétaire paie 30 à 60% trop cher parce qu'il ne sait pas. Le gestionnaire de flotte VTC perd</w:t>
+        <w:t xml:space="preserve">. À Adjamé, Yopougon, Marcory, Koumassi, des milliers de vendeurs vendent des pièces neuves, d'occasion importées (Japon, Dubai), ré-usinées et aftermarket — sans catalogue, sans prix affichés, sans garantie, sans facture, sans traçabilité. Le mécanicien perd 2 à 4 heures par pièce à faire le tour des magasins. Le propriétaire paie 30 à 60% trop cher parce qu'il ne sait pas. Le gestionnaire de flotte VTC perd</w:t>
       </w:r>
       <w:r>
         <w:t xml:space="preserve"> </w:t>
@@ -877,7 +877,7 @@
           <w:b/>
           <w:bCs/>
         </w:rPr>
-        <w:t xml:space="preserve">Cantines d'Adjamé / Yopougon</w:t>
+        <w:t xml:space="preserve">Magasins d'Adjamé / Yopougon</w:t>
       </w:r>
       <w:r>
         <w:t xml:space="preserve"> </w:t>
@@ -2068,7 +2068,7 @@
         <w:t xml:space="preserve"> </w:t>
       </w:r>
       <w:r>
-        <w:t xml:space="preserve">: 300 vendeurs onboardés, 80% du stock visible des cantines majeures.</w:t>
+        <w:t xml:space="preserve">: 300 vendeurs onboardés, 80% du stock visible des magasins majeurs.</w:t>
       </w:r>
     </w:p>
     <w:p>
@@ -3180,7 +3180,7 @@
         </w:numPr>
       </w:pPr>
       <w:r>
-        <w:t xml:space="preserve">UNATRCI, syndicats vendeurs Adjamé, chambres consulaires. Légitimité institutionnelle = porte ouverte sur les cantines historiques.</w:t>
+        <w:t xml:space="preserve">UNATRCI, syndicats vendeurs Adjamé, chambres consulaires. Légitimité institutionnelle = porte ouverte sur les magasins historiques.</w:t>
       </w:r>
     </w:p>
     <w:p>
@@ -3271,7 +3271,7 @@
         </w:numPr>
       </w:pPr>
       <w:r>
-        <w:t xml:space="preserve">Radio Yopougon, Radio Treichville, panneaux affichage cantines. Message simple : « Pièces.ci — la pièce qu'il te faut, au juste prix, livrée. »</w:t>
+        <w:t xml:space="preserve">Radio Yopougon, Radio Treichville, panneaux affichage magasins. Message simple : « Pièces.ci — la pièce qu'il te faut, au juste prix, livrée. »</w:t>
       </w:r>
     </w:p>
     <w:p>
@@ -3316,7 +3316,7 @@
         <w:t xml:space="preserve"> </w:t>
       </w:r>
       <w:r>
-        <w:t xml:space="preserve">(les Liaisons recommandent Pièces aux mécaniciens qu'ils croisent en cantine).</w:t>
+        <w:t xml:space="preserve">(les Liaisons recommandent Pièces aux mécaniciens qu'ils croisent en magasin).</w:t>
       </w:r>
     </w:p>
     <w:bookmarkEnd w:id="36"/>

</xml_diff>